<commit_message>
feat(retainer): the second party can be a Dependent — label it everywhere
'Inviter / Sponsor' becomes 'Inviter / Sponsor / Dependent' on all three
surfaces that name the second party: the retainer panel subhead, the
signatory-template picker label, and the pa-inviter master agreement
itself (parties clause + contact block). Verified the edited .docx still
fills through Docxtemplater with no unfilled tags.

Co-Authored-By: Claude Fable 5 <noreply@anthropic.com>
</commit_message>
<xml_diff>
--- a/src/templates/retainer/pa-inviter.docx
+++ b/src/templates/retainer/pa-inviter.docx
@@ -212,7 +212,7 @@
           <w:szCs w:val="22"/>
           <w:rtl w:val="0"/>
         </w:rPr>
-        <w:t xml:space="preserve"> (hereinafter the “Inviter/Sponsor”)</w:t>
+        <w:t xml:space="preserve"> (hereinafter the “Inviter/Sponsor/Dependent”)</w:t>
       </w:r>
       <w:r>
         <w:rPr>
@@ -7897,7 +7897,7 @@
                 <w:u w:val="single"/>
                 <w:rtl w:val="0"/>
               </w:rPr>
-              <w:t xml:space="preserve">Inviter/Sponsor</w:t>
+              <w:t xml:space="preserve">Inviter/Sponsor/Dependent</w:t>
             </w:r>
           </w:p>
           <w:p>

</xml_diff>